<commit_message>
docs: expand PS01-PS03 detailed content
</commit_message>
<xml_diff>
--- a/PS01政务软件研发及运维技术服务/4-PS01政务软件研发及运维技术服务-科技成果转化说明材料.docx
+++ b/PS01政务软件研发及运维技术服务/4-PS01政务软件研发及运维技术服务-科技成果转化说明材料.docx
@@ -19,94 +19,629 @@
     </w:p>
     <w:p>
       <w:pPr>
-        <w:jc w:val="center"/>
-      </w:pPr>
-      <w:r>
-        <w:t xml:space="preserve">(2025.12)</w:t>
-      </w:r>
-    </w:p>
-    <w:p>
-      <w:r>
-        <w:t xml:space="preserve"/>
-      </w:r>
-    </w:p>
-    <w:p>
-      <w:r>
-        <w:t xml:space="preserve">一、科技成果名称：政务软件研发及运维技术服务</w:t>
-      </w:r>
-    </w:p>
-    <w:p>
-      <w:r>
-        <w:t xml:space="preserve">——巡查调度系统V1.0（PC端管理软件）</w:t>
-      </w:r>
-    </w:p>
-    <w:p>
-      <w:r>
-        <w:t xml:space="preserve">——巡查调度小程序V1.0（微信小程序端）</w:t>
-      </w:r>
-    </w:p>
-    <w:p>
-      <w:r>
-        <w:t xml:space="preserve">——许邻e家-基层管理小程序V1.0（微信小程序端）</w:t>
-      </w:r>
-    </w:p>
-    <w:p>
-      <w:r>
-        <w:t xml:space="preserve"/>
-      </w:r>
-    </w:p>
-    <w:p>
-      <w:r>
-        <w:t xml:space="preserve">二、科技成果类型：软件著作权</w:t>
-      </w:r>
-    </w:p>
-    <w:p>
-      <w:r>
-        <w:t xml:space="preserve">三、科技成果来源：自主研发</w:t>
-      </w:r>
-    </w:p>
-    <w:p>
-      <w:r>
-        <w:t xml:space="preserve"/>
-      </w:r>
-    </w:p>
-    <w:p>
-      <w:r>
-        <w:t xml:space="preserve">四、成果转化描述：</w:t>
-      </w:r>
-    </w:p>
-    <w:p>
-      <w:r>
-        <w:t xml:space="preserve">本项目研发形成的子项目成果，采用“自行投资+项目交付部署+持续运维服务”的方式实现成果转化，将研发成果应用于相关单位的业务管理与服务场景中，推动业务流程线上化、数据标准化与统计分析可视化。</w:t>
-      </w:r>
-    </w:p>
-    <w:p>
-      <w:pPr>
-        <w:pStyle w:val="ListParagraph"/>
-        <w:numPr>
-          <w:ilvl w:val="0"/>
-          <w:numId w:val="2"/>
-        </w:numPr>
-      </w:pPr>
-      <w:r>
-        <w:t xml:space="preserve">巡查调度系统/小程序成果转化：面向水系管理与应急调度场景部署应用，提升水位上报与应急任务处置效率。</w:t>
-      </w:r>
-    </w:p>
-    <w:p>
-      <w:pPr>
-        <w:pStyle w:val="ListParagraph"/>
-        <w:numPr>
-          <w:ilvl w:val="0"/>
-          <w:numId w:val="2"/>
-        </w:numPr>
-      </w:pPr>
-      <w:r>
-        <w:t xml:space="preserve">许邻e家小程序成果转化：面向社区治理与网格管理场景推广应用，提升居民参与度与基层协同效率。</w:t>
-      </w:r>
-    </w:p>
-    <w:p>
-      <w:r>
-        <w:t xml:space="preserve">成果转化过程中，相关登记表、使用手册、功能说明等支撑材料已整理归档，确保成果可追溯、可复用、可审计。</w:t>
+        <w:spacing w:after="100" w:line="320"/>
+      </w:pPr>
+      <w:r>
+        <w:rPr>
+          <w:b/>
+          <w:bCs/>
+        </w:rPr>
+        <w:t xml:space="preserve">科技成果名称：</w:t>
+      </w:r>
+      <w:r>
+        <w:t xml:space="preserve">政务软件研发及运维技术服务</w:t>
+      </w:r>
+    </w:p>
+    <w:p>
+      <w:pPr>
+        <w:spacing w:after="100" w:line="320"/>
+      </w:pPr>
+      <w:r>
+        <w:rPr>
+          <w:b/>
+          <w:bCs/>
+        </w:rPr>
+        <w:t xml:space="preserve">科技成果类型：</w:t>
+      </w:r>
+      <w:r>
+        <w:t xml:space="preserve">软件著作权/软件系统成果</w:t>
+      </w:r>
+    </w:p>
+    <w:p>
+      <w:pPr>
+        <w:spacing w:after="100" w:line="320"/>
+      </w:pPr>
+      <w:r>
+        <w:rPr>
+          <w:b/>
+          <w:bCs/>
+        </w:rPr>
+        <w:t xml:space="preserve">科技成果来源：</w:t>
+      </w:r>
+      <w:r>
+        <w:t xml:space="preserve">自主研发</w:t>
+      </w:r>
+    </w:p>
+    <w:p>
+      <w:pPr>
+        <w:spacing w:after="100" w:line="320"/>
+      </w:pPr>
+      <w:r>
+        <w:rPr>
+          <w:b/>
+          <w:bCs/>
+        </w:rPr>
+        <w:t xml:space="preserve">转化周期：</w:t>
+      </w:r>
+      <w:r>
+        <w:t xml:space="preserve">2025年度</w:t>
+      </w:r>
+    </w:p>
+    <w:p>
+      <w:pPr>
+        <w:pStyle w:val="Heading1"/>
+      </w:pPr>
+      <w:r>
+        <w:rPr>
+          <w:b/>
+          <w:bCs/>
+        </w:rPr>
+        <w:t xml:space="preserve">一、成果概况</w:t>
+      </w:r>
+    </w:p>
+    <w:p>
+      <w:pPr>
+        <w:spacing w:after="120" w:line="360"/>
+      </w:pPr>
+      <w:r>
+        <w:t xml:space="preserve">本项目围绕“政务软件研发及运维技术服务”形成系列研发成果，核心目标为：围绕城区水系巡查调度与基层治理移动协同需求，形成覆盖“PC管理端+小程序端+运维保障”的成套研发成果，提升指挥调度效率、基层治理响应速度和服务闭环能力。。项目成果不是单一模块，而是围绕实际业务场景构建的一组可交付、可部署、可运维的软件系统能力。</w:t>
+      </w:r>
+    </w:p>
+    <w:p>
+      <w:pPr>
+        <w:pStyle w:val="ListParagraph"/>
+        <w:numPr>
+          <w:ilvl w:val="0"/>
+          <w:numId w:val="2"/>
+        </w:numPr>
+        <w:spacing w:after="80" w:line="320"/>
+      </w:pPr>
+      <w:r>
+        <w:t xml:space="preserve">巡查调度系统V1.0（PC端）</w:t>
+      </w:r>
+    </w:p>
+    <w:p>
+      <w:pPr>
+        <w:pStyle w:val="ListParagraph"/>
+        <w:numPr>
+          <w:ilvl w:val="0"/>
+          <w:numId w:val="2"/>
+        </w:numPr>
+        <w:spacing w:after="80" w:line="320"/>
+      </w:pPr>
+      <w:r>
+        <w:t xml:space="preserve">巡查调度小程序V1.0（微信小程序端）</w:t>
+      </w:r>
+    </w:p>
+    <w:p>
+      <w:pPr>
+        <w:pStyle w:val="ListParagraph"/>
+        <w:numPr>
+          <w:ilvl w:val="0"/>
+          <w:numId w:val="2"/>
+        </w:numPr>
+        <w:spacing w:after="80" w:line="320"/>
+      </w:pPr>
+      <w:r>
+        <w:t xml:space="preserve">许邻e家基层管理小程序V1.0（微信小程序端）</w:t>
+      </w:r>
+    </w:p>
+    <w:p>
+      <w:pPr>
+        <w:pStyle w:val="Heading1"/>
+      </w:pPr>
+      <w:r>
+        <w:rPr>
+          <w:b/>
+          <w:bCs/>
+        </w:rPr>
+        <w:t xml:space="preserve">二、成果权属与形成过程</w:t>
+      </w:r>
+    </w:p>
+    <w:p>
+      <w:pPr>
+        <w:spacing w:after="120" w:line="360"/>
+      </w:pPr>
+      <w:r>
+        <w:t xml:space="preserve">本项目成果由公司自主投入研发形成，研发过程涵盖需求调研、原型设计、技术开发、功能测试、试运行、问题修正和资料归档等环节。项目的登记表、使用手册等支撑资料已归档，可证明成果形成路径的真实性和完整性。</w:t>
+      </w:r>
+    </w:p>
+    <w:p>
+      <w:pPr>
+        <w:pStyle w:val="ListParagraph"/>
+        <w:numPr>
+          <w:ilvl w:val="0"/>
+          <w:numId w:val="2"/>
+        </w:numPr>
+        <w:spacing w:after="80" w:line="320"/>
+      </w:pPr>
+      <w:r>
+        <w:t xml:space="preserve">原始文件支撑资料/2巡查调度平台PC+小程序/1-1巡查调度系统（PC版）-登记表.doc</w:t>
+      </w:r>
+    </w:p>
+    <w:p>
+      <w:pPr>
+        <w:pStyle w:val="ListParagraph"/>
+        <w:numPr>
+          <w:ilvl w:val="0"/>
+          <w:numId w:val="2"/>
+        </w:numPr>
+        <w:spacing w:after="80" w:line="320"/>
+      </w:pPr>
+      <w:r>
+        <w:t xml:space="preserve">原始文件支撑资料/2巡查调度平台PC+小程序/2-1巡查调度小程序-登记表.doc</w:t>
+      </w:r>
+    </w:p>
+    <w:p>
+      <w:pPr>
+        <w:pStyle w:val="ListParagraph"/>
+        <w:numPr>
+          <w:ilvl w:val="0"/>
+          <w:numId w:val="2"/>
+        </w:numPr>
+        <w:spacing w:after="80" w:line="320"/>
+      </w:pPr>
+      <w:r>
+        <w:t xml:space="preserve">原始文件支撑资料/3基层治理微平台PC+许邻e家小程序/2-1许邻e家-登记表.doc</w:t>
+      </w:r>
+    </w:p>
+    <w:p>
+      <w:pPr>
+        <w:pStyle w:val="ListParagraph"/>
+        <w:numPr>
+          <w:ilvl w:val="0"/>
+          <w:numId w:val="2"/>
+        </w:numPr>
+        <w:spacing w:after="80" w:line="320"/>
+      </w:pPr>
+      <w:r>
+        <w:t xml:space="preserve">原始文件支撑资料/2巡查调度平台PC+小程序/1-3巡查调度系统（PC版）使用手册.docx</w:t>
+      </w:r>
+    </w:p>
+    <w:p>
+      <w:pPr>
+        <w:pStyle w:val="ListParagraph"/>
+        <w:numPr>
+          <w:ilvl w:val="0"/>
+          <w:numId w:val="2"/>
+        </w:numPr>
+        <w:spacing w:after="80" w:line="320"/>
+      </w:pPr>
+      <w:r>
+        <w:t xml:space="preserve">原始文件支撑资料/2巡查调度平台PC+小程序/2-3巡查调度小程序使用手册.docx</w:t>
+      </w:r>
+    </w:p>
+    <w:p>
+      <w:pPr>
+        <w:pStyle w:val="ListParagraph"/>
+        <w:numPr>
+          <w:ilvl w:val="0"/>
+          <w:numId w:val="2"/>
+        </w:numPr>
+        <w:spacing w:after="80" w:line="320"/>
+      </w:pPr>
+      <w:r>
+        <w:t xml:space="preserve">原始文件支撑资料/3基层治理微平台PC+许邻e家小程序/2-3许邻e家-使用手册.docx</w:t>
+      </w:r>
+    </w:p>
+    <w:p>
+      <w:pPr>
+        <w:pStyle w:val="Heading1"/>
+      </w:pPr>
+      <w:r>
+        <w:rPr>
+          <w:b/>
+          <w:bCs/>
+        </w:rPr>
+        <w:t xml:space="preserve">三、成果转化方式</w:t>
+      </w:r>
+    </w:p>
+    <w:p>
+      <w:pPr>
+        <w:pStyle w:val="ListParagraph"/>
+        <w:numPr>
+          <w:ilvl w:val="0"/>
+          <w:numId w:val="3"/>
+        </w:numPr>
+        <w:spacing w:after="80" w:line="320"/>
+      </w:pPr>
+      <w:r>
+        <w:t xml:space="preserve">自行投资转化：由公司组织研发投入、测试投入、部署与运维支持，将成果转化为可持续交付的软件产品与服务能力。</w:t>
+      </w:r>
+    </w:p>
+    <w:p>
+      <w:pPr>
+        <w:pStyle w:val="ListParagraph"/>
+        <w:numPr>
+          <w:ilvl w:val="0"/>
+          <w:numId w:val="3"/>
+        </w:numPr>
+        <w:spacing w:after="80" w:line="320"/>
+      </w:pPr>
+      <w:r>
+        <w:t xml:space="preserve">项目实施转化：通过对接具体业务单位需求，将研发成果部署到实际业务场景中，实现从研发成果到业务工具的落地。</w:t>
+      </w:r>
+    </w:p>
+    <w:p>
+      <w:pPr>
+        <w:pStyle w:val="ListParagraph"/>
+        <w:numPr>
+          <w:ilvl w:val="0"/>
+          <w:numId w:val="3"/>
+        </w:numPr>
+        <w:spacing w:after="80" w:line="320"/>
+      </w:pPr>
+      <w:r>
+        <w:t xml:space="preserve">运维服务转化：通过后续版本优化、问题修复、运行监测、用户培训、数据维护等方式，将研发成果转化为持续服务能力。</w:t>
+      </w:r>
+    </w:p>
+    <w:p>
+      <w:pPr>
+        <w:pStyle w:val="Heading1"/>
+      </w:pPr>
+      <w:r>
+        <w:rPr>
+          <w:b/>
+          <w:bCs/>
+        </w:rPr>
+        <w:t xml:space="preserve">四、分项成果转化说明</w:t>
+      </w:r>
+    </w:p>
+    <w:p>
+      <w:pPr>
+        <w:pStyle w:val="Heading2"/>
+      </w:pPr>
+      <w:r>
+        <w:rPr>
+          <w:b/>
+          <w:bCs/>
+        </w:rPr>
+        <w:t xml:space="preserve">巡查调度系统V1.0（PC端）</w:t>
+      </w:r>
+    </w:p>
+    <w:p>
+      <w:pPr>
+        <w:pStyle w:val="ListParagraph"/>
+        <w:numPr>
+          <w:ilvl w:val="0"/>
+          <w:numId w:val="2"/>
+        </w:numPr>
+        <w:spacing w:after="80" w:line="320"/>
+      </w:pPr>
+      <w:r>
+        <w:t xml:space="preserve">闸坝、水闸水库、雨水口、易涝点等基础信息统一管理</w:t>
+      </w:r>
+    </w:p>
+    <w:p>
+      <w:pPr>
+        <w:pStyle w:val="ListParagraph"/>
+        <w:numPr>
+          <w:ilvl w:val="0"/>
+          <w:numId w:val="2"/>
+        </w:numPr>
+        <w:spacing w:after="80" w:line="320"/>
+      </w:pPr>
+      <w:r>
+        <w:t xml:space="preserve">应急任务发布、跟踪、督办与统计分析</w:t>
+      </w:r>
+    </w:p>
+    <w:p>
+      <w:pPr>
+        <w:pStyle w:val="ListParagraph"/>
+        <w:numPr>
+          <w:ilvl w:val="0"/>
+          <w:numId w:val="2"/>
+        </w:numPr>
+        <w:spacing w:after="80" w:line="320"/>
+      </w:pPr>
+      <w:r>
+        <w:t xml:space="preserve">巡查记录审核、问题分派、整改反馈与闭环留痕</w:t>
+      </w:r>
+    </w:p>
+    <w:p>
+      <w:pPr>
+        <w:pStyle w:val="ListParagraph"/>
+        <w:numPr>
+          <w:ilvl w:val="0"/>
+          <w:numId w:val="2"/>
+        </w:numPr>
+        <w:spacing w:after="80" w:line="320"/>
+      </w:pPr>
+      <w:r>
+        <w:t xml:space="preserve">GIS地图展示、点位查询、趋势分析与报表导出</w:t>
+      </w:r>
+    </w:p>
+    <w:p>
+      <w:pPr>
+        <w:spacing w:after="120" w:line="360"/>
+      </w:pPr>
+      <w:r>
+        <w:t xml:space="preserve">转化应用说明：在水系管理与防汛调度场景中部署应用，承接日常巡查、汛期值守、应急指令下发与过程监督等工作，强化后台调度能力。</w:t>
+      </w:r>
+    </w:p>
+    <w:p>
+      <w:pPr>
+        <w:pStyle w:val="Heading2"/>
+      </w:pPr>
+      <w:r>
+        <w:rPr>
+          <w:b/>
+          <w:bCs/>
+        </w:rPr>
+        <w:t xml:space="preserve">巡查调度小程序V1.0（微信小程序端）</w:t>
+      </w:r>
+    </w:p>
+    <w:p>
+      <w:pPr>
+        <w:pStyle w:val="ListParagraph"/>
+        <w:numPr>
+          <w:ilvl w:val="0"/>
+          <w:numId w:val="2"/>
+        </w:numPr>
+        <w:spacing w:after="80" w:line="320"/>
+      </w:pPr>
+      <w:r>
+        <w:t xml:space="preserve">移动端水位上报、巡查记录填报、现场图片上传</w:t>
+      </w:r>
+    </w:p>
+    <w:p>
+      <w:pPr>
+        <w:pStyle w:val="ListParagraph"/>
+        <w:numPr>
+          <w:ilvl w:val="0"/>
+          <w:numId w:val="2"/>
+        </w:numPr>
+        <w:spacing w:after="80" w:line="320"/>
+      </w:pPr>
+      <w:r>
+        <w:t xml:space="preserve">应急任务接收、反馈、提醒与消息通知</w:t>
+      </w:r>
+    </w:p>
+    <w:p>
+      <w:pPr>
+        <w:pStyle w:val="ListParagraph"/>
+        <w:numPr>
+          <w:ilvl w:val="0"/>
+          <w:numId w:val="2"/>
+        </w:numPr>
+        <w:spacing w:after="80" w:line="320"/>
+      </w:pPr>
+      <w:r>
+        <w:t xml:space="preserve">地图定位、轨迹校验、现场处置辅助</w:t>
+      </w:r>
+    </w:p>
+    <w:p>
+      <w:pPr>
+        <w:pStyle w:val="ListParagraph"/>
+        <w:numPr>
+          <w:ilvl w:val="0"/>
+          <w:numId w:val="2"/>
+        </w:numPr>
+        <w:spacing w:after="80" w:line="320"/>
+      </w:pPr>
+      <w:r>
+        <w:t xml:space="preserve">与PC端统一数据库与统一任务状态同步</w:t>
+      </w:r>
+    </w:p>
+    <w:p>
+      <w:pPr>
+        <w:spacing w:after="120" w:line="360"/>
+      </w:pPr>
+      <w:r>
+        <w:t xml:space="preserve">转化应用说明：作为一线人员作业入口投入使用，降低现场采集与反馈成本，缩短信息从发现到处置的时间链路。</w:t>
+      </w:r>
+    </w:p>
+    <w:p>
+      <w:pPr>
+        <w:pStyle w:val="Heading2"/>
+      </w:pPr>
+      <w:r>
+        <w:rPr>
+          <w:b/>
+          <w:bCs/>
+        </w:rPr>
+        <w:t xml:space="preserve">许邻e家基层管理小程序V1.0（微信小程序端）</w:t>
+      </w:r>
+    </w:p>
+    <w:p>
+      <w:pPr>
+        <w:pStyle w:val="ListParagraph"/>
+        <w:numPr>
+          <w:ilvl w:val="0"/>
+          <w:numId w:val="2"/>
+        </w:numPr>
+        <w:spacing w:after="80" w:line="320"/>
+      </w:pPr>
+      <w:r>
+        <w:t xml:space="preserve">社区活动、志愿服务、便民电话、掌上办事等居民服务能力</w:t>
+      </w:r>
+    </w:p>
+    <w:p>
+      <w:pPr>
+        <w:pStyle w:val="ListParagraph"/>
+        <w:numPr>
+          <w:ilvl w:val="0"/>
+          <w:numId w:val="2"/>
+        </w:numPr>
+        <w:spacing w:after="80" w:line="320"/>
+      </w:pPr>
+      <w:r>
+        <w:t xml:space="preserve">居民吹哨、网格巡查、问题上报与流转反馈</w:t>
+      </w:r>
+    </w:p>
+    <w:p>
+      <w:pPr>
+        <w:pStyle w:val="ListParagraph"/>
+        <w:numPr>
+          <w:ilvl w:val="0"/>
+          <w:numId w:val="2"/>
+        </w:numPr>
+        <w:spacing w:after="80" w:line="320"/>
+      </w:pPr>
+      <w:r>
+        <w:t xml:space="preserve">居民信息、商户信息、网格信息移动化查询维护</w:t>
+      </w:r>
+    </w:p>
+    <w:p>
+      <w:pPr>
+        <w:pStyle w:val="ListParagraph"/>
+        <w:numPr>
+          <w:ilvl w:val="0"/>
+          <w:numId w:val="2"/>
+        </w:numPr>
+        <w:spacing w:after="80" w:line="320"/>
+      </w:pPr>
+      <w:r>
+        <w:t xml:space="preserve">与社区后台管理协同形成“居民反馈-网格处理-部门响应”闭环</w:t>
+      </w:r>
+    </w:p>
+    <w:p>
+      <w:pPr>
+        <w:spacing w:after="120" w:line="360"/>
+      </w:pPr>
+      <w:r>
+        <w:t xml:space="preserve">转化应用说明：应用于基层社区治理与便民服务场景，提升网格员移动工作效率与居民参与度，形成可推广的智慧社区轻量化入口。</w:t>
+      </w:r>
+    </w:p>
+    <w:p>
+      <w:pPr>
+        <w:pStyle w:val="Heading1"/>
+      </w:pPr>
+      <w:r>
+        <w:rPr>
+          <w:b/>
+          <w:bCs/>
+        </w:rPr>
+        <w:t xml:space="preserve">五、成果转化后的实际价值</w:t>
+      </w:r>
+    </w:p>
+    <w:p>
+      <w:pPr>
+        <w:spacing w:after="120" w:line="360"/>
+      </w:pPr>
+      <w:r>
+        <w:t xml:space="preserve">项目实施后，可显著提升水系巡查与基层治理的响应效率，减少人工电话通知与纸质记录，强化过程追踪与统计分析，为后续多区域推广提供可复制经验。</w:t>
+      </w:r>
+    </w:p>
+    <w:p>
+      <w:pPr>
+        <w:pStyle w:val="ListParagraph"/>
+        <w:numPr>
+          <w:ilvl w:val="0"/>
+          <w:numId w:val="2"/>
+        </w:numPr>
+        <w:spacing w:after="80" w:line="320"/>
+      </w:pPr>
+      <w:r>
+        <w:t xml:space="preserve">管理价值：实现业务流程线上化、任务闭环化、数据可视化和责任留痕。</w:t>
+      </w:r>
+    </w:p>
+    <w:p>
+      <w:pPr>
+        <w:pStyle w:val="ListParagraph"/>
+        <w:numPr>
+          <w:ilvl w:val="0"/>
+          <w:numId w:val="2"/>
+        </w:numPr>
+        <w:spacing w:after="80" w:line="320"/>
+      </w:pPr>
+      <w:r>
+        <w:t xml:space="preserve">效率价值：减少纸质记录、电话沟通和重复统计工作量，缩短信息传递时间。</w:t>
+      </w:r>
+    </w:p>
+    <w:p>
+      <w:pPr>
+        <w:pStyle w:val="ListParagraph"/>
+        <w:numPr>
+          <w:ilvl w:val="0"/>
+          <w:numId w:val="2"/>
+        </w:numPr>
+        <w:spacing w:after="80" w:line="320"/>
+      </w:pPr>
+      <w:r>
+        <w:t xml:space="preserve">复制价值：形成标准化部署资料、功能清单和运维机制，便于在同类单位推广应用。</w:t>
+      </w:r>
+    </w:p>
+    <w:p>
+      <w:pPr>
+        <w:pStyle w:val="ListParagraph"/>
+        <w:numPr>
+          <w:ilvl w:val="0"/>
+          <w:numId w:val="2"/>
+        </w:numPr>
+        <w:spacing w:after="80" w:line="320"/>
+      </w:pPr>
+      <w:r>
+        <w:t xml:space="preserve">持续价值：通过版本迭代、问题优化和功能扩展，将研发成果持续转化为运维服务收入和客户粘性。</w:t>
+      </w:r>
+    </w:p>
+    <w:p>
+      <w:pPr>
+        <w:pStyle w:val="Heading1"/>
+      </w:pPr>
+      <w:r>
+        <w:rPr>
+          <w:b/>
+          <w:bCs/>
+        </w:rPr>
+        <w:t xml:space="preserve">六、成果转化路径与后续计划</w:t>
+      </w:r>
+    </w:p>
+    <w:p>
+      <w:pPr>
+        <w:spacing w:after="120" w:line="360"/>
+      </w:pPr>
+      <w:r>
+        <w:t xml:space="preserve">后续将结合不同客户或业务单位的实际需求，对现有成果进行模块裁剪、接口适配、流程调整和权限优化，在保证核心能力稳定的基础上形成差异化交付方案。对于已投入使用的场景，将持续跟踪运行数据、用户反馈和问题闭环情况，推动成果从“可用”向“好用、易运维、可复制”升级。</w:t>
+      </w:r>
+    </w:p>
+    <w:p>
+      <w:pPr>
+        <w:pStyle w:val="ListParagraph"/>
+        <w:numPr>
+          <w:ilvl w:val="0"/>
+          <w:numId w:val="2"/>
+        </w:numPr>
+        <w:spacing w:after="80" w:line="320"/>
+      </w:pPr>
+      <w:r>
+        <w:t xml:space="preserve">完善版本发布与问题工单机制，缩短反馈闭环周期。</w:t>
+      </w:r>
+    </w:p>
+    <w:p>
+      <w:pPr>
+        <w:pStyle w:val="ListParagraph"/>
+        <w:numPr>
+          <w:ilvl w:val="0"/>
+          <w:numId w:val="2"/>
+        </w:numPr>
+        <w:spacing w:after="80" w:line="320"/>
+      </w:pPr>
+      <w:r>
+        <w:t xml:space="preserve">继续沉淀实施模板、培训资料和常见问题手册，提升交付效率。</w:t>
+      </w:r>
+    </w:p>
+    <w:p>
+      <w:pPr>
+        <w:pStyle w:val="ListParagraph"/>
+        <w:numPr>
+          <w:ilvl w:val="0"/>
+          <w:numId w:val="2"/>
+        </w:numPr>
+        <w:spacing w:after="80" w:line="320"/>
+      </w:pPr>
+      <w:r>
+        <w:t xml:space="preserve">结合后续业务需求，拓展统计分析、接口集成、移动端增强等能力。</w:t>
       </w:r>
     </w:p>
     <w:sectPr>
@@ -295,6 +830,18 @@
       </w:pPr>
     </w:lvl>
   </w:abstractNum>
+  <w:abstractNum w:abstractNumId="3" w15:restartNumberingAfterBreak="0">
+    <w:multiLevelType w:val="hybridMultilevel"/>
+    <w:lvl w:ilvl="0" w15:tentative="1">
+      <w:start w:val="1"/>
+      <w:numFmt w:val="decimal"/>
+      <w:lvlText w:val="%1."/>
+      <w:lvlJc w:val="left"/>
+      <w:pPr>
+        <w:ind w:left="720" w:hanging="360"/>
+      </w:pPr>
+    </w:lvl>
+  </w:abstractNum>
   <w:num w:numId="1">
     <w:abstractNumId w:val="1"/>
     <w:lvlOverride w:ilvl="0">
@@ -303,6 +850,12 @@
   </w:num>
   <w:num w:numId="2">
     <w:abstractNumId w:val="2"/>
+    <w:lvlOverride w:ilvl="0">
+      <w:startOverride w:val="1"/>
+    </w:lvlOverride>
+  </w:num>
+  <w:num w:numId="3">
+    <w:abstractNumId w:val="3"/>
     <w:lvlOverride w:ilvl="0">
       <w:startOverride w:val="1"/>
     </w:lvlOverride>
@@ -501,15 +1054,15 @@
     <w:pPr>
       <w:keepNext w:val="false"/>
       <w:keepLines w:val="false"/>
-      <w:spacing w:after="240" w:before="240"/>
+      <w:spacing w:after="160" w:before="220"/>
       <w:outlineLvl w:val="0"/>
     </w:pPr>
     <w:rPr>
       <w:rFonts w:ascii="Arial" w:eastAsia="Noto Sans CJK SC" w:hAnsi="Arial"/>
       <w:b/>
       <w:bCs/>
-      <w:sz w:val="32"/>
-      <w:szCs w:val="32"/>
+      <w:sz w:val="30"/>
+      <w:szCs w:val="30"/>
     </w:rPr>
   </w:style>
   <w:style w:type="paragraph" w:styleId="Heading2">
@@ -520,7 +1073,7 @@
     <w:pPr>
       <w:keepNext w:val="false"/>
       <w:keepLines w:val="false"/>
-      <w:spacing w:after="180" w:before="180"/>
+      <w:spacing w:after="120" w:before="160"/>
       <w:outlineLvl w:val="1"/>
     </w:pPr>
     <w:rPr>

</xml_diff>